<commit_message>
Add screenshots and update docs
</commit_message>
<xml_diff>
--- a/docs/ExecBrief_ProjectAegis_v1.0.docx
+++ b/docs/ExecBrief_ProjectAegis_v1.0.docx
@@ -23,12 +23,6 @@
         <w:gridCol w:w="9746"/>
       </w:tblGrid>
       <w:tr>
-        <w:tblPrEx>
-          <w:tblCellMar>
-            <w:top w:w="0" w:type="dxa"/>
-            <w:bottom w:w="0" w:type="dxa"/>
-          </w:tblCellMar>
-        </w:tblPrEx>
         <w:tc>
           <w:tcPr>
             <w:tcW w:w="9746" w:type="dxa"/>
@@ -150,11 +144,6 @@
     </w:p>
     <w:p>
       <w:pPr>
-        <w:spacing w:after="80"/>
-      </w:pPr>
-    </w:p>
-    <w:p>
-      <w:pPr>
         <w:pBdr>
           <w:bottom w:val="single" w:sz="4" w:space="4" w:color="2C5F8A"/>
         </w:pBdr>
@@ -206,12 +195,6 @@
         <w:gridCol w:w="5346"/>
       </w:tblGrid>
       <w:tr>
-        <w:tblPrEx>
-          <w:tblCellMar>
-            <w:top w:w="0" w:type="dxa"/>
-            <w:bottom w:w="0" w:type="dxa"/>
-          </w:tblCellMar>
-        </w:tblPrEx>
         <w:trPr>
           <w:tblHeader/>
         </w:trPr>
@@ -285,12 +268,6 @@
         </w:tc>
       </w:tr>
       <w:tr>
-        <w:tblPrEx>
-          <w:tblCellMar>
-            <w:top w:w="0" w:type="dxa"/>
-            <w:bottom w:w="0" w:type="dxa"/>
-          </w:tblCellMar>
-        </w:tblPrEx>
         <w:tc>
           <w:tcPr>
             <w:tcW w:w="4400" w:type="dxa"/>
@@ -371,12 +348,6 @@
         </w:tc>
       </w:tr>
       <w:tr>
-        <w:tblPrEx>
-          <w:tblCellMar>
-            <w:top w:w="0" w:type="dxa"/>
-            <w:bottom w:w="0" w:type="dxa"/>
-          </w:tblCellMar>
-        </w:tblPrEx>
         <w:tc>
           <w:tcPr>
             <w:tcW w:w="4400" w:type="dxa"/>
@@ -457,12 +428,6 @@
         </w:tc>
       </w:tr>
       <w:tr>
-        <w:tblPrEx>
-          <w:tblCellMar>
-            <w:top w:w="0" w:type="dxa"/>
-            <w:bottom w:w="0" w:type="dxa"/>
-          </w:tblCellMar>
-        </w:tblPrEx>
         <w:tc>
           <w:tcPr>
             <w:tcW w:w="4400" w:type="dxa"/>
@@ -564,7 +529,7 @@
           <w:sz w:val="22"/>
           <w:szCs w:val="22"/>
         </w:rPr>
-        <w:t>2   The Solution — To-Be State</w:t>
+        <w:t>2   The Solution</w:t>
       </w:r>
     </w:p>
     <w:p>
@@ -602,12 +567,6 @@
         <w:gridCol w:w="3873"/>
       </w:tblGrid>
       <w:tr>
-        <w:tblPrEx>
-          <w:tblCellMar>
-            <w:top w:w="0" w:type="dxa"/>
-            <w:bottom w:w="0" w:type="dxa"/>
-          </w:tblCellMar>
-        </w:tblPrEx>
         <w:trPr>
           <w:tblHeader/>
         </w:trPr>
@@ -715,12 +674,6 @@
         </w:tc>
       </w:tr>
       <w:tr>
-        <w:tblPrEx>
-          <w:tblCellMar>
-            <w:top w:w="0" w:type="dxa"/>
-            <w:bottom w:w="0" w:type="dxa"/>
-          </w:tblCellMar>
-        </w:tblPrEx>
         <w:tc>
           <w:tcPr>
             <w:tcW w:w="2800" w:type="dxa"/>
@@ -821,12 +774,6 @@
         </w:tc>
       </w:tr>
       <w:tr>
-        <w:tblPrEx>
-          <w:tblCellMar>
-            <w:top w:w="0" w:type="dxa"/>
-            <w:bottom w:w="0" w:type="dxa"/>
-          </w:tblCellMar>
-        </w:tblPrEx>
         <w:tc>
           <w:tcPr>
             <w:tcW w:w="2800" w:type="dxa"/>
@@ -925,12 +872,6 @@
         </w:tc>
       </w:tr>
       <w:tr>
-        <w:tblPrEx>
-          <w:tblCellMar>
-            <w:top w:w="0" w:type="dxa"/>
-            <w:bottom w:w="0" w:type="dxa"/>
-          </w:tblCellMar>
-        </w:tblPrEx>
         <w:tc>
           <w:tcPr>
             <w:tcW w:w="2800" w:type="dxa"/>
@@ -1029,12 +970,6 @@
         </w:tc>
       </w:tr>
       <w:tr>
-        <w:tblPrEx>
-          <w:tblCellMar>
-            <w:top w:w="0" w:type="dxa"/>
-            <w:bottom w:w="0" w:type="dxa"/>
-          </w:tblCellMar>
-        </w:tblPrEx>
         <w:tc>
           <w:tcPr>
             <w:tcW w:w="2800" w:type="dxa"/>
@@ -1133,12 +1068,6 @@
         </w:tc>
       </w:tr>
       <w:tr>
-        <w:tblPrEx>
-          <w:tblCellMar>
-            <w:top w:w="0" w:type="dxa"/>
-            <w:bottom w:w="0" w:type="dxa"/>
-          </w:tblCellMar>
-        </w:tblPrEx>
         <w:tc>
           <w:tcPr>
             <w:tcW w:w="2800" w:type="dxa"/>
@@ -1237,18 +1166,28 @@
         </w:tc>
       </w:tr>
     </w:tbl>
-    <w:p>
-      <w:r>
-        <w:br w:type="page"/>
-      </w:r>
-    </w:p>
     <w:p>
       <w:pPr>
         <w:pBdr>
           <w:bottom w:val="single" w:sz="4" w:space="4" w:color="2C5F8A"/>
         </w:pBdr>
         <w:spacing w:before="180" w:after="80"/>
+        <w:rPr>
+          <w:rFonts w:ascii="Arial" w:eastAsia="Arial" w:hAnsi="Arial" w:cs="Arial"/>
+          <w:b/>
+          <w:bCs/>
+          <w:color w:val="2C5F8A"/>
+          <w:sz w:val="22"/>
+          <w:szCs w:val="22"/>
+        </w:rPr>
       </w:pPr>
+      <w:r>
+        <w:br w:type="page"/>
+      </w:r>
+      <w:r>
+        <w:lastRenderedPageBreak/>
+        <w:br/>
+      </w:r>
       <w:r>
         <w:rPr>
           <w:rFonts w:ascii="Arial" w:eastAsia="Arial" w:hAnsi="Arial" w:cs="Arial"/>
@@ -1258,7 +1197,6 @@
           <w:sz w:val="22"/>
           <w:szCs w:val="22"/>
         </w:rPr>
-        <w:lastRenderedPageBreak/>
         <w:t>3   What Is Being Launched</w:t>
       </w:r>
     </w:p>
@@ -1428,7 +1366,7 @@
     </w:p>
     <w:tbl>
       <w:tblPr>
-        <w:tblW w:w="9746" w:type="dxa"/>
+        <w:tblW w:w="7507" w:type="dxa"/>
         <w:tblBorders>
           <w:top w:val="single" w:sz="4" w:space="0" w:color="auto"/>
           <w:left w:val="single" w:sz="4" w:space="0" w:color="auto"/>
@@ -1444,23 +1382,17 @@
         <w:tblLook w:val="04A0" w:firstRow="1" w:lastRow="0" w:firstColumn="1" w:lastColumn="0" w:noHBand="0" w:noVBand="1"/>
       </w:tblPr>
       <w:tblGrid>
-        <w:gridCol w:w="4200"/>
-        <w:gridCol w:w="2173"/>
-        <w:gridCol w:w="3373"/>
+        <w:gridCol w:w="3105"/>
+        <w:gridCol w:w="1788"/>
+        <w:gridCol w:w="2614"/>
       </w:tblGrid>
       <w:tr>
-        <w:tblPrEx>
-          <w:tblCellMar>
-            <w:top w:w="0" w:type="dxa"/>
-            <w:bottom w:w="0" w:type="dxa"/>
-          </w:tblCellMar>
-        </w:tblPrEx>
         <w:trPr>
           <w:tblHeader/>
         </w:trPr>
         <w:tc>
           <w:tcPr>
-            <w:tcW w:w="4200" w:type="dxa"/>
+            <w:tcW w:w="3105" w:type="dxa"/>
             <w:tcBorders>
               <w:top w:val="single" w:sz="1" w:space="0" w:color="CBD5E1"/>
               <w:left w:val="single" w:sz="1" w:space="0" w:color="CBD5E1"/>
@@ -1494,7 +1426,7 @@
         </w:tc>
         <w:tc>
           <w:tcPr>
-            <w:tcW w:w="2173" w:type="dxa"/>
+            <w:tcW w:w="1788" w:type="dxa"/>
             <w:tcBorders>
               <w:top w:val="single" w:sz="1" w:space="0" w:color="CBD5E1"/>
               <w:left w:val="single" w:sz="1" w:space="0" w:color="CBD5E1"/>
@@ -1528,7 +1460,7 @@
         </w:tc>
         <w:tc>
           <w:tcPr>
-            <w:tcW w:w="3373" w:type="dxa"/>
+            <w:tcW w:w="2614" w:type="dxa"/>
             <w:tcBorders>
               <w:top w:val="single" w:sz="1" w:space="0" w:color="CBD5E1"/>
               <w:left w:val="single" w:sz="1" w:space="0" w:color="CBD5E1"/>
@@ -1562,15 +1494,9 @@
         </w:tc>
       </w:tr>
       <w:tr>
-        <w:tblPrEx>
-          <w:tblCellMar>
-            <w:top w:w="0" w:type="dxa"/>
-            <w:bottom w:w="0" w:type="dxa"/>
-          </w:tblCellMar>
-        </w:tblPrEx>
-        <w:tc>
-          <w:tcPr>
-            <w:tcW w:w="4200" w:type="dxa"/>
+        <w:tc>
+          <w:tcPr>
+            <w:tcW w:w="3105" w:type="dxa"/>
             <w:tcBorders>
               <w:top w:val="single" w:sz="1" w:space="0" w:color="CBD5E1"/>
               <w:left w:val="single" w:sz="1" w:space="0" w:color="CBD5E1"/>
@@ -1602,7 +1528,7 @@
         </w:tc>
         <w:tc>
           <w:tcPr>
-            <w:tcW w:w="2173" w:type="dxa"/>
+            <w:tcW w:w="1788" w:type="dxa"/>
             <w:tcBorders>
               <w:top w:val="single" w:sz="1" w:space="0" w:color="CBD5E1"/>
               <w:left w:val="single" w:sz="1" w:space="0" w:color="CBD5E1"/>
@@ -1633,7 +1559,7 @@
         </w:tc>
         <w:tc>
           <w:tcPr>
-            <w:tcW w:w="3373" w:type="dxa"/>
+            <w:tcW w:w="2614" w:type="dxa"/>
             <w:tcBorders>
               <w:top w:val="single" w:sz="1" w:space="0" w:color="CBD5E1"/>
               <w:left w:val="single" w:sz="1" w:space="0" w:color="CBD5E1"/>
@@ -1664,15 +1590,9 @@
         </w:tc>
       </w:tr>
       <w:tr>
-        <w:tblPrEx>
-          <w:tblCellMar>
-            <w:top w:w="0" w:type="dxa"/>
-            <w:bottom w:w="0" w:type="dxa"/>
-          </w:tblCellMar>
-        </w:tblPrEx>
-        <w:tc>
-          <w:tcPr>
-            <w:tcW w:w="4200" w:type="dxa"/>
+        <w:tc>
+          <w:tcPr>
+            <w:tcW w:w="3105" w:type="dxa"/>
             <w:tcBorders>
               <w:top w:val="single" w:sz="1" w:space="0" w:color="CBD5E1"/>
               <w:left w:val="single" w:sz="1" w:space="0" w:color="CBD5E1"/>
@@ -1703,7 +1623,7 @@
         </w:tc>
         <w:tc>
           <w:tcPr>
-            <w:tcW w:w="2173" w:type="dxa"/>
+            <w:tcW w:w="1788" w:type="dxa"/>
             <w:tcBorders>
               <w:top w:val="single" w:sz="1" w:space="0" w:color="CBD5E1"/>
               <w:left w:val="single" w:sz="1" w:space="0" w:color="CBD5E1"/>
@@ -1734,7 +1654,7 @@
         </w:tc>
         <w:tc>
           <w:tcPr>
-            <w:tcW w:w="3373" w:type="dxa"/>
+            <w:tcW w:w="2614" w:type="dxa"/>
             <w:tcBorders>
               <w:top w:val="single" w:sz="1" w:space="0" w:color="CBD5E1"/>
               <w:left w:val="single" w:sz="1" w:space="0" w:color="CBD5E1"/>
@@ -1765,15 +1685,9 @@
         </w:tc>
       </w:tr>
       <w:tr>
-        <w:tblPrEx>
-          <w:tblCellMar>
-            <w:top w:w="0" w:type="dxa"/>
-            <w:bottom w:w="0" w:type="dxa"/>
-          </w:tblCellMar>
-        </w:tblPrEx>
-        <w:tc>
-          <w:tcPr>
-            <w:tcW w:w="4200" w:type="dxa"/>
+        <w:tc>
+          <w:tcPr>
+            <w:tcW w:w="3105" w:type="dxa"/>
             <w:tcBorders>
               <w:top w:val="single" w:sz="1" w:space="0" w:color="CBD5E1"/>
               <w:left w:val="single" w:sz="1" w:space="0" w:color="CBD5E1"/>
@@ -1805,7 +1719,7 @@
         </w:tc>
         <w:tc>
           <w:tcPr>
-            <w:tcW w:w="2173" w:type="dxa"/>
+            <w:tcW w:w="1788" w:type="dxa"/>
             <w:tcBorders>
               <w:top w:val="single" w:sz="1" w:space="0" w:color="CBD5E1"/>
               <w:left w:val="single" w:sz="1" w:space="0" w:color="CBD5E1"/>
@@ -1836,7 +1750,7 @@
         </w:tc>
         <w:tc>
           <w:tcPr>
-            <w:tcW w:w="3373" w:type="dxa"/>
+            <w:tcW w:w="2614" w:type="dxa"/>
             <w:tcBorders>
               <w:top w:val="single" w:sz="1" w:space="0" w:color="CBD5E1"/>
               <w:left w:val="single" w:sz="1" w:space="0" w:color="CBD5E1"/>
@@ -1867,15 +1781,9 @@
         </w:tc>
       </w:tr>
       <w:tr>
-        <w:tblPrEx>
-          <w:tblCellMar>
-            <w:top w:w="0" w:type="dxa"/>
-            <w:bottom w:w="0" w:type="dxa"/>
-          </w:tblCellMar>
-        </w:tblPrEx>
-        <w:tc>
-          <w:tcPr>
-            <w:tcW w:w="4200" w:type="dxa"/>
+        <w:tc>
+          <w:tcPr>
+            <w:tcW w:w="3105" w:type="dxa"/>
             <w:tcBorders>
               <w:top w:val="single" w:sz="1" w:space="0" w:color="CBD5E1"/>
               <w:left w:val="single" w:sz="1" w:space="0" w:color="CBD5E1"/>
@@ -1906,7 +1814,7 @@
         </w:tc>
         <w:tc>
           <w:tcPr>
-            <w:tcW w:w="2173" w:type="dxa"/>
+            <w:tcW w:w="1788" w:type="dxa"/>
             <w:tcBorders>
               <w:top w:val="single" w:sz="1" w:space="0" w:color="CBD5E1"/>
               <w:left w:val="single" w:sz="1" w:space="0" w:color="CBD5E1"/>
@@ -1937,7 +1845,7 @@
         </w:tc>
         <w:tc>
           <w:tcPr>
-            <w:tcW w:w="3373" w:type="dxa"/>
+            <w:tcW w:w="2614" w:type="dxa"/>
             <w:tcBorders>
               <w:top w:val="single" w:sz="1" w:space="0" w:color="CBD5E1"/>
               <w:left w:val="single" w:sz="1" w:space="0" w:color="CBD5E1"/>
@@ -1968,15 +1876,9 @@
         </w:tc>
       </w:tr>
       <w:tr>
-        <w:tblPrEx>
-          <w:tblCellMar>
-            <w:top w:w="0" w:type="dxa"/>
-            <w:bottom w:w="0" w:type="dxa"/>
-          </w:tblCellMar>
-        </w:tblPrEx>
-        <w:tc>
-          <w:tcPr>
-            <w:tcW w:w="4200" w:type="dxa"/>
+        <w:tc>
+          <w:tcPr>
+            <w:tcW w:w="3105" w:type="dxa"/>
             <w:tcBorders>
               <w:top w:val="single" w:sz="1" w:space="0" w:color="CBD5E1"/>
               <w:left w:val="single" w:sz="1" w:space="0" w:color="CBD5E1"/>
@@ -2008,7 +1910,7 @@
         </w:tc>
         <w:tc>
           <w:tcPr>
-            <w:tcW w:w="2173" w:type="dxa"/>
+            <w:tcW w:w="1788" w:type="dxa"/>
             <w:tcBorders>
               <w:top w:val="single" w:sz="1" w:space="0" w:color="CBD5E1"/>
               <w:left w:val="single" w:sz="1" w:space="0" w:color="CBD5E1"/>
@@ -2039,7 +1941,7 @@
         </w:tc>
         <w:tc>
           <w:tcPr>
-            <w:tcW w:w="3373" w:type="dxa"/>
+            <w:tcW w:w="2614" w:type="dxa"/>
             <w:tcBorders>
               <w:top w:val="single" w:sz="1" w:space="0" w:color="CBD5E1"/>
               <w:left w:val="single" w:sz="1" w:space="0" w:color="CBD5E1"/>
@@ -2070,15 +1972,9 @@
         </w:tc>
       </w:tr>
       <w:tr>
-        <w:tblPrEx>
-          <w:tblCellMar>
-            <w:top w:w="0" w:type="dxa"/>
-            <w:bottom w:w="0" w:type="dxa"/>
-          </w:tblCellMar>
-        </w:tblPrEx>
-        <w:tc>
-          <w:tcPr>
-            <w:tcW w:w="4200" w:type="dxa"/>
+        <w:tc>
+          <w:tcPr>
+            <w:tcW w:w="3105" w:type="dxa"/>
             <w:tcBorders>
               <w:top w:val="single" w:sz="1" w:space="0" w:color="CBD5E1"/>
               <w:left w:val="single" w:sz="1" w:space="0" w:color="CBD5E1"/>
@@ -2109,7 +2005,7 @@
         </w:tc>
         <w:tc>
           <w:tcPr>
-            <w:tcW w:w="2173" w:type="dxa"/>
+            <w:tcW w:w="1788" w:type="dxa"/>
             <w:tcBorders>
               <w:top w:val="single" w:sz="1" w:space="0" w:color="CBD5E1"/>
               <w:left w:val="single" w:sz="1" w:space="0" w:color="CBD5E1"/>
@@ -2140,7 +2036,7 @@
         </w:tc>
         <w:tc>
           <w:tcPr>
-            <w:tcW w:w="3373" w:type="dxa"/>
+            <w:tcW w:w="2614" w:type="dxa"/>
             <w:tcBorders>
               <w:top w:val="single" w:sz="1" w:space="0" w:color="CBD5E1"/>
               <w:left w:val="single" w:sz="1" w:space="0" w:color="CBD5E1"/>
@@ -2171,15 +2067,9 @@
         </w:tc>
       </w:tr>
       <w:tr>
-        <w:tblPrEx>
-          <w:tblCellMar>
-            <w:top w:w="0" w:type="dxa"/>
-            <w:bottom w:w="0" w:type="dxa"/>
-          </w:tblCellMar>
-        </w:tblPrEx>
-        <w:tc>
-          <w:tcPr>
-            <w:tcW w:w="4200" w:type="dxa"/>
+        <w:tc>
+          <w:tcPr>
+            <w:tcW w:w="3105" w:type="dxa"/>
             <w:tcBorders>
               <w:top w:val="single" w:sz="1" w:space="0" w:color="CBD5E1"/>
               <w:left w:val="single" w:sz="1" w:space="0" w:color="CBD5E1"/>
@@ -2211,7 +2101,7 @@
         </w:tc>
         <w:tc>
           <w:tcPr>
-            <w:tcW w:w="2173" w:type="dxa"/>
+            <w:tcW w:w="1788" w:type="dxa"/>
             <w:tcBorders>
               <w:top w:val="single" w:sz="1" w:space="0" w:color="CBD5E1"/>
               <w:left w:val="single" w:sz="1" w:space="0" w:color="CBD5E1"/>
@@ -2242,7 +2132,7 @@
         </w:tc>
         <w:tc>
           <w:tcPr>
-            <w:tcW w:w="3373" w:type="dxa"/>
+            <w:tcW w:w="2614" w:type="dxa"/>
             <w:tcBorders>
               <w:top w:val="single" w:sz="1" w:space="0" w:color="CBD5E1"/>
               <w:left w:val="single" w:sz="1" w:space="0" w:color="CBD5E1"/>
@@ -2273,15 +2163,9 @@
         </w:tc>
       </w:tr>
       <w:tr>
-        <w:tblPrEx>
-          <w:tblCellMar>
-            <w:top w:w="0" w:type="dxa"/>
-            <w:bottom w:w="0" w:type="dxa"/>
-          </w:tblCellMar>
-        </w:tblPrEx>
-        <w:tc>
-          <w:tcPr>
-            <w:tcW w:w="4200" w:type="dxa"/>
+        <w:tc>
+          <w:tcPr>
+            <w:tcW w:w="3105" w:type="dxa"/>
             <w:tcBorders>
               <w:top w:val="single" w:sz="1" w:space="0" w:color="CBD5E1"/>
               <w:left w:val="single" w:sz="1" w:space="0" w:color="CBD5E1"/>
@@ -2312,7 +2196,7 @@
         </w:tc>
         <w:tc>
           <w:tcPr>
-            <w:tcW w:w="2173" w:type="dxa"/>
+            <w:tcW w:w="1788" w:type="dxa"/>
             <w:tcBorders>
               <w:top w:val="single" w:sz="1" w:space="0" w:color="CBD5E1"/>
               <w:left w:val="single" w:sz="1" w:space="0" w:color="CBD5E1"/>
@@ -2343,7 +2227,7 @@
         </w:tc>
         <w:tc>
           <w:tcPr>
-            <w:tcW w:w="3373" w:type="dxa"/>
+            <w:tcW w:w="2614" w:type="dxa"/>
             <w:tcBorders>
               <w:top w:val="single" w:sz="1" w:space="0" w:color="CBD5E1"/>
               <w:left w:val="single" w:sz="1" w:space="0" w:color="CBD5E1"/>
@@ -2374,15 +2258,9 @@
         </w:tc>
       </w:tr>
       <w:tr>
-        <w:tblPrEx>
-          <w:tblCellMar>
-            <w:top w:w="0" w:type="dxa"/>
-            <w:bottom w:w="0" w:type="dxa"/>
-          </w:tblCellMar>
-        </w:tblPrEx>
-        <w:tc>
-          <w:tcPr>
-            <w:tcW w:w="4200" w:type="dxa"/>
+        <w:tc>
+          <w:tcPr>
+            <w:tcW w:w="3105" w:type="dxa"/>
             <w:tcBorders>
               <w:top w:val="single" w:sz="1" w:space="0" w:color="CBD5E1"/>
               <w:left w:val="single" w:sz="1" w:space="0" w:color="CBD5E1"/>
@@ -2414,7 +2292,7 @@
         </w:tc>
         <w:tc>
           <w:tcPr>
-            <w:tcW w:w="2173" w:type="dxa"/>
+            <w:tcW w:w="1788" w:type="dxa"/>
             <w:tcBorders>
               <w:top w:val="single" w:sz="1" w:space="0" w:color="CBD5E1"/>
               <w:left w:val="single" w:sz="1" w:space="0" w:color="CBD5E1"/>
@@ -2445,7 +2323,7 @@
         </w:tc>
         <w:tc>
           <w:tcPr>
-            <w:tcW w:w="3373" w:type="dxa"/>
+            <w:tcW w:w="2614" w:type="dxa"/>
             <w:tcBorders>
               <w:top w:val="single" w:sz="1" w:space="0" w:color="CBD5E1"/>
               <w:left w:val="single" w:sz="1" w:space="0" w:color="CBD5E1"/>
@@ -2476,15 +2354,9 @@
         </w:tc>
       </w:tr>
       <w:tr>
-        <w:tblPrEx>
-          <w:tblCellMar>
-            <w:top w:w="0" w:type="dxa"/>
-            <w:bottom w:w="0" w:type="dxa"/>
-          </w:tblCellMar>
-        </w:tblPrEx>
-        <w:tc>
-          <w:tcPr>
-            <w:tcW w:w="4200" w:type="dxa"/>
+        <w:tc>
+          <w:tcPr>
+            <w:tcW w:w="3105" w:type="dxa"/>
             <w:tcBorders>
               <w:top w:val="single" w:sz="1" w:space="0" w:color="CBD5E1"/>
               <w:left w:val="single" w:sz="1" w:space="0" w:color="CBD5E1"/>
@@ -2515,7 +2387,7 @@
         </w:tc>
         <w:tc>
           <w:tcPr>
-            <w:tcW w:w="2173" w:type="dxa"/>
+            <w:tcW w:w="1788" w:type="dxa"/>
             <w:tcBorders>
               <w:top w:val="single" w:sz="1" w:space="0" w:color="CBD5E1"/>
               <w:left w:val="single" w:sz="1" w:space="0" w:color="CBD5E1"/>
@@ -2546,7 +2418,7 @@
         </w:tc>
         <w:tc>
           <w:tcPr>
-            <w:tcW w:w="3373" w:type="dxa"/>
+            <w:tcW w:w="2614" w:type="dxa"/>
             <w:tcBorders>
               <w:top w:val="single" w:sz="1" w:space="0" w:color="CBD5E1"/>
               <w:left w:val="single" w:sz="1" w:space="0" w:color="CBD5E1"/>
@@ -2579,7 +2451,7 @@
       <w:tr>
         <w:tc>
           <w:tcPr>
-            <w:tcW w:w="2454" w:type="dxa"/>
+            <w:tcW w:w="3105" w:type="dxa"/>
             <w:tcBorders>
               <w:top w:val="single" w:sz="1" w:space="0" w:color="CBD5E1"/>
               <w:left w:val="single" w:sz="1" w:space="0" w:color="CBD5E1"/>
@@ -2610,7 +2482,7 @@
         </w:tc>
         <w:tc>
           <w:tcPr>
-            <w:tcW w:w="1000" w:type="dxa"/>
+            <w:tcW w:w="1788" w:type="dxa"/>
             <w:tcBorders>
               <w:top w:val="single" w:sz="1" w:space="0" w:color="CBD5E1"/>
               <w:left w:val="single" w:sz="1" w:space="0" w:color="CBD5E1"/>
@@ -2641,38 +2513,7 @@
         </w:tc>
         <w:tc>
           <w:tcPr>
-            <w:tcW w:w="2173" w:type="dxa"/>
-            <w:tcBorders>
-              <w:top w:val="single" w:sz="1" w:space="0" w:color="CBD5E1"/>
-              <w:left w:val="single" w:sz="1" w:space="0" w:color="CBD5E1"/>
-              <w:bottom w:val="single" w:sz="1" w:space="0" w:color="CBD5E1"/>
-              <w:right w:val="single" w:sz="1" w:space="0" w:color="CBD5E1"/>
-            </w:tcBorders>
-            <w:tcMar>
-              <w:top w:w="80" w:type="dxa"/>
-              <w:left w:w="120" w:type="dxa"/>
-              <w:bottom w:w="80" w:type="dxa"/>
-              <w:right w:w="120" w:type="dxa"/>
-            </w:tcMar>
-          </w:tcPr>
-          <w:p>
-            <w:pPr>
-              <w:spacing w:before="40" w:after="40"/>
-            </w:pPr>
-            <w:r>
-              <w:rPr>
-                <w:rFonts w:ascii="Arial" w:eastAsia="Arial" w:hAnsi="Arial" w:cs="Arial"/>
-                <w:color w:val="1E293B"/>
-                <w:sz w:val="19"/>
-                <w:szCs w:val="19"/>
-              </w:rPr>
-              <w:t>No target</w:t>
-            </w:r>
-          </w:p>
-        </w:tc>
-        <w:tc>
-          <w:tcPr>
-            <w:tcW w:w="3373" w:type="dxa"/>
+            <w:tcW w:w="2614" w:type="dxa"/>
             <w:tcBorders>
               <w:top w:val="single" w:sz="1" w:space="0" w:color="CBD5E1"/>
               <w:left w:val="single" w:sz="1" w:space="0" w:color="CBD5E1"/>
@@ -2844,38 +2685,6 @@
     </w:p>
     <w:p>
       <w:pPr>
-        <w:spacing w:before="60" w:after="80"/>
-        <w:rPr>
-          <w:rFonts w:ascii="Arial" w:eastAsia="Arial" w:hAnsi="Arial" w:cs="Arial"/>
-          <w:color w:val="1E293B"/>
-        </w:rPr>
-      </w:pPr>
-    </w:p>
-    <w:p>
-      <w:pPr>
-        <w:spacing w:before="60" w:after="80"/>
-        <w:rPr>
-          <w:rFonts w:ascii="Arial" w:eastAsia="Arial" w:hAnsi="Arial" w:cs="Arial"/>
-          <w:color w:val="1E293B"/>
-        </w:rPr>
-      </w:pPr>
-    </w:p>
-    <w:p>
-      <w:pPr>
-        <w:spacing w:before="60" w:after="80"/>
-        <w:rPr>
-          <w:rFonts w:ascii="Arial" w:eastAsia="Arial" w:hAnsi="Arial" w:cs="Arial"/>
-          <w:color w:val="1E293B"/>
-        </w:rPr>
-      </w:pPr>
-    </w:p>
-    <w:p>
-      <w:pPr>
-        <w:spacing w:before="60" w:after="80"/>
-      </w:pPr>
-    </w:p>
-    <w:p>
-      <w:pPr>
         <w:pBdr>
           <w:bottom w:val="single" w:sz="4" w:space="4" w:color="2C5F8A"/>
         </w:pBdr>
@@ -2890,7 +2699,6 @@
           <w:sz w:val="22"/>
           <w:szCs w:val="22"/>
         </w:rPr>
-        <w:lastRenderedPageBreak/>
         <w:t>5   Risks &amp; Mitigations</w:t>
       </w:r>
     </w:p>
@@ -2917,12 +2725,6 @@
         <w:gridCol w:w="5046"/>
       </w:tblGrid>
       <w:tr>
-        <w:tblPrEx>
-          <w:tblCellMar>
-            <w:top w:w="0" w:type="dxa"/>
-            <w:bottom w:w="0" w:type="dxa"/>
-          </w:tblCellMar>
-        </w:tblPrEx>
         <w:trPr>
           <w:tblHeader/>
         </w:trPr>
@@ -3030,12 +2832,6 @@
         </w:tc>
       </w:tr>
       <w:tr>
-        <w:tblPrEx>
-          <w:tblCellMar>
-            <w:top w:w="0" w:type="dxa"/>
-            <w:bottom w:w="0" w:type="dxa"/>
-          </w:tblCellMar>
-        </w:tblPrEx>
         <w:tc>
           <w:tcPr>
             <w:tcW w:w="3300" w:type="dxa"/>
@@ -3133,12 +2929,6 @@
         </w:tc>
       </w:tr>
       <w:tr>
-        <w:tblPrEx>
-          <w:tblCellMar>
-            <w:top w:w="0" w:type="dxa"/>
-            <w:bottom w:w="0" w:type="dxa"/>
-          </w:tblCellMar>
-        </w:tblPrEx>
         <w:tc>
           <w:tcPr>
             <w:tcW w:w="3300" w:type="dxa"/>
@@ -3239,12 +3029,6 @@
         </w:tc>
       </w:tr>
       <w:tr>
-        <w:tblPrEx>
-          <w:tblCellMar>
-            <w:top w:w="0" w:type="dxa"/>
-            <w:bottom w:w="0" w:type="dxa"/>
-          </w:tblCellMar>
-        </w:tblPrEx>
         <w:tc>
           <w:tcPr>
             <w:tcW w:w="3300" w:type="dxa"/>
@@ -3342,12 +3126,6 @@
         </w:tc>
       </w:tr>
       <w:tr>
-        <w:tblPrEx>
-          <w:tblCellMar>
-            <w:top w:w="0" w:type="dxa"/>
-            <w:bottom w:w="0" w:type="dxa"/>
-          </w:tblCellMar>
-        </w:tblPrEx>
         <w:tc>
           <w:tcPr>
             <w:tcW w:w="3300" w:type="dxa"/>
@@ -3447,12 +3225,6 @@
         </w:tc>
       </w:tr>
       <w:tr>
-        <w:tblPrEx>
-          <w:tblCellMar>
-            <w:top w:w="0" w:type="dxa"/>
-            <w:bottom w:w="0" w:type="dxa"/>
-          </w:tblCellMar>
-        </w:tblPrEx>
         <w:tc>
           <w:tcPr>
             <w:tcW w:w="3300" w:type="dxa"/>
@@ -3596,12 +3368,6 @@
         <w:gridCol w:w="6746"/>
       </w:tblGrid>
       <w:tr>
-        <w:tblPrEx>
-          <w:tblCellMar>
-            <w:top w:w="0" w:type="dxa"/>
-            <w:bottom w:w="0" w:type="dxa"/>
-          </w:tblCellMar>
-        </w:tblPrEx>
         <w:trPr>
           <w:tblHeader/>
         </w:trPr>
@@ -3675,12 +3441,6 @@
         </w:tc>
       </w:tr>
       <w:tr>
-        <w:tblPrEx>
-          <w:tblCellMar>
-            <w:top w:w="0" w:type="dxa"/>
-            <w:bottom w:w="0" w:type="dxa"/>
-          </w:tblCellMar>
-        </w:tblPrEx>
         <w:tc>
           <w:tcPr>
             <w:tcW w:w="3000" w:type="dxa"/>
@@ -3747,12 +3507,6 @@
         </w:tc>
       </w:tr>
       <w:tr>
-        <w:tblPrEx>
-          <w:tblCellMar>
-            <w:top w:w="0" w:type="dxa"/>
-            <w:bottom w:w="0" w:type="dxa"/>
-          </w:tblCellMar>
-        </w:tblPrEx>
         <w:tc>
           <w:tcPr>
             <w:tcW w:w="3000" w:type="dxa"/>
@@ -3817,12 +3571,6 @@
         </w:tc>
       </w:tr>
       <w:tr>
-        <w:tblPrEx>
-          <w:tblCellMar>
-            <w:top w:w="0" w:type="dxa"/>
-            <w:bottom w:w="0" w:type="dxa"/>
-          </w:tblCellMar>
-        </w:tblPrEx>
         <w:tc>
           <w:tcPr>
             <w:tcW w:w="3000" w:type="dxa"/>
@@ -3936,12 +3684,6 @@
         <w:gridCol w:w="4073"/>
       </w:tblGrid>
       <w:tr>
-        <w:tblPrEx>
-          <w:tblCellMar>
-            <w:top w:w="0" w:type="dxa"/>
-            <w:bottom w:w="0" w:type="dxa"/>
-          </w:tblCellMar>
-        </w:tblPrEx>
         <w:trPr>
           <w:tblHeader/>
         </w:trPr>
@@ -4049,12 +3791,6 @@
         </w:tc>
       </w:tr>
       <w:tr>
-        <w:tblPrEx>
-          <w:tblCellMar>
-            <w:top w:w="0" w:type="dxa"/>
-            <w:bottom w:w="0" w:type="dxa"/>
-          </w:tblCellMar>
-        </w:tblPrEx>
         <w:tc>
           <w:tcPr>
             <w:tcW w:w="1300" w:type="dxa"/>
@@ -4153,12 +3889,6 @@
         </w:tc>
       </w:tr>
       <w:tr>
-        <w:tblPrEx>
-          <w:tblCellMar>
-            <w:top w:w="0" w:type="dxa"/>
-            <w:bottom w:w="0" w:type="dxa"/>
-          </w:tblCellMar>
-        </w:tblPrEx>
         <w:tc>
           <w:tcPr>
             <w:tcW w:w="1300" w:type="dxa"/>
@@ -4254,12 +3984,6 @@
         </w:tc>
       </w:tr>
       <w:tr>
-        <w:tblPrEx>
-          <w:tblCellMar>
-            <w:top w:w="0" w:type="dxa"/>
-            <w:bottom w:w="0" w:type="dxa"/>
-          </w:tblCellMar>
-        </w:tblPrEx>
         <w:tc>
           <w:tcPr>
             <w:tcW w:w="1300" w:type="dxa"/>
@@ -4358,12 +4082,6 @@
         </w:tc>
       </w:tr>
       <w:tr>
-        <w:tblPrEx>
-          <w:tblCellMar>
-            <w:top w:w="0" w:type="dxa"/>
-            <w:bottom w:w="0" w:type="dxa"/>
-          </w:tblCellMar>
-        </w:tblPrEx>
         <w:tc>
           <w:tcPr>
             <w:tcW w:w="1300" w:type="dxa"/>
@@ -4496,7 +4214,15 @@
           <w:rFonts w:ascii="Arial" w:eastAsia="Arial" w:hAnsi="Arial" w:cs="Arial"/>
           <w:color w:val="1E293B"/>
         </w:rPr>
-        <w:t>All build, testing, and documentation tasks are complete. One step remains: deployment to Streamlit Community Cloud (push to GitHub, connect at share.streamlit.io, add API key in Secrets Manager, deploy). Estimated completion time is 30 minutes. The live dashboard URL and a 3–5 minute walkthrough recording will be circulated to this group immediately post-deployment.</w:t>
+        <w:t xml:space="preserve">All build, testing, and documentation tasks are complete. One step remains: deployment to Streamlit Community Cloud (push to GitHub, connect at share.streamlit.io, add API key in Secrets Manager, deploy). </w:t>
+      </w:r>
+      <w:r>
+        <w:rPr>
+          <w:rFonts w:ascii="Arial" w:eastAsia="Arial" w:hAnsi="Arial" w:cs="Arial"/>
+          <w:color w:val="1E293B"/>
+        </w:rPr>
+        <w:lastRenderedPageBreak/>
+        <w:t>Estimated completion time is 30 minutes. The live dashboard URL and a 3–5 minute walkthrough recording will be circulated to this group immediately post-deployment.</w:t>
       </w:r>
     </w:p>
     <w:p>
@@ -4506,11 +4232,6 @@
           <w:rFonts w:ascii="Arial" w:eastAsia="Arial" w:hAnsi="Arial" w:cs="Arial"/>
           <w:color w:val="1E293B"/>
         </w:rPr>
-      </w:pPr>
-    </w:p>
-    <w:p>
-      <w:pPr>
-        <w:spacing w:before="60" w:after="80"/>
       </w:pPr>
     </w:p>
     <w:p>
@@ -4529,7 +4250,6 @@
           <w:sz w:val="22"/>
           <w:szCs w:val="22"/>
         </w:rPr>
-        <w:lastRenderedPageBreak/>
         <w:t>9   Ownership &amp; Accountability</w:t>
       </w:r>
     </w:p>
@@ -4555,12 +4275,6 @@
         <w:gridCol w:w="5346"/>
       </w:tblGrid>
       <w:tr>
-        <w:tblPrEx>
-          <w:tblCellMar>
-            <w:top w:w="0" w:type="dxa"/>
-            <w:bottom w:w="0" w:type="dxa"/>
-          </w:tblCellMar>
-        </w:tblPrEx>
         <w:trPr>
           <w:tblHeader/>
         </w:trPr>
@@ -4634,12 +4348,6 @@
         </w:tc>
       </w:tr>
       <w:tr>
-        <w:tblPrEx>
-          <w:tblCellMar>
-            <w:top w:w="0" w:type="dxa"/>
-            <w:bottom w:w="0" w:type="dxa"/>
-          </w:tblCellMar>
-        </w:tblPrEx>
         <w:tc>
           <w:tcPr>
             <w:tcW w:w="4400" w:type="dxa"/>
@@ -4667,7 +4375,6 @@
                 <w:color w:val="1E293B"/>
                 <w:sz w:val="19"/>
                 <w:szCs w:val="19"/>
-                <w:highlight w:val="yellow"/>
               </w:rPr>
               <w:t>System build and maintenance</w:t>
             </w:r>
@@ -4701,18 +4408,12 @@
                 <w:sz w:val="19"/>
                 <w:szCs w:val="19"/>
               </w:rPr>
-              <w:t>Smita Harding, AI Transformation Lead</w:t>
+              <w:t>TBC</w:t>
             </w:r>
           </w:p>
         </w:tc>
       </w:tr>
       <w:tr>
-        <w:tblPrEx>
-          <w:tblCellMar>
-            <w:top w:w="0" w:type="dxa"/>
-            <w:bottom w:w="0" w:type="dxa"/>
-          </w:tblCellMar>
-        </w:tblPrEx>
         <w:tc>
           <w:tcPr>
             <w:tcW w:w="4400" w:type="dxa"/>
@@ -4777,12 +4478,6 @@
         </w:tc>
       </w:tr>
       <w:tr>
-        <w:tblPrEx>
-          <w:tblCellMar>
-            <w:top w:w="0" w:type="dxa"/>
-            <w:bottom w:w="0" w:type="dxa"/>
-          </w:tblCellMar>
-        </w:tblPrEx>
         <w:tc>
           <w:tcPr>
             <w:tcW w:w="4400" w:type="dxa"/>
@@ -4849,12 +4544,6 @@
         </w:tc>
       </w:tr>
       <w:tr>
-        <w:tblPrEx>
-          <w:tblCellMar>
-            <w:top w:w="0" w:type="dxa"/>
-            <w:bottom w:w="0" w:type="dxa"/>
-          </w:tblCellMar>
-        </w:tblPrEx>
         <w:tc>
           <w:tcPr>
             <w:tcW w:w="4400" w:type="dxa"/>
@@ -4961,503 +4650,9 @@
           <w:sz w:val="19"/>
           <w:szCs w:val="19"/>
         </w:rPr>
-        <w:t>I confirm I have reviewed Project Aegis v1.0 and approve deployment to Streamlit Community Cloud.</w:t>
+        <w:t xml:space="preserve">Launch signoff required from VP Operations, Director of Operations and Director of Technology </w:t>
       </w:r>
     </w:p>
-    <w:tbl>
-      <w:tblPr>
-        <w:tblW w:w="9746" w:type="dxa"/>
-        <w:tblBorders>
-          <w:top w:val="single" w:sz="4" w:space="0" w:color="auto"/>
-          <w:left w:val="single" w:sz="4" w:space="0" w:color="auto"/>
-          <w:bottom w:val="single" w:sz="4" w:space="0" w:color="auto"/>
-          <w:right w:val="single" w:sz="4" w:space="0" w:color="auto"/>
-          <w:insideH w:val="single" w:sz="4" w:space="0" w:color="auto"/>
-          <w:insideV w:val="single" w:sz="4" w:space="0" w:color="auto"/>
-        </w:tblBorders>
-        <w:tblCellMar>
-          <w:left w:w="10" w:type="dxa"/>
-          <w:right w:w="10" w:type="dxa"/>
-        </w:tblCellMar>
-        <w:tblLook w:val="04A0" w:firstRow="1" w:lastRow="0" w:firstColumn="1" w:lastColumn="0" w:noHBand="0" w:noVBand="1"/>
-      </w:tblPr>
-      <w:tblGrid>
-        <w:gridCol w:w="2700"/>
-        <w:gridCol w:w="2349"/>
-        <w:gridCol w:w="2349"/>
-        <w:gridCol w:w="2348"/>
-      </w:tblGrid>
-      <w:tr>
-        <w:tblPrEx>
-          <w:tblCellMar>
-            <w:top w:w="0" w:type="dxa"/>
-            <w:bottom w:w="0" w:type="dxa"/>
-          </w:tblCellMar>
-        </w:tblPrEx>
-        <w:trPr>
-          <w:tblHeader/>
-        </w:trPr>
-        <w:tc>
-          <w:tcPr>
-            <w:tcW w:w="2700" w:type="dxa"/>
-            <w:tcBorders>
-              <w:top w:val="single" w:sz="1" w:space="0" w:color="CBD5E1"/>
-              <w:left w:val="single" w:sz="1" w:space="0" w:color="CBD5E1"/>
-              <w:bottom w:val="single" w:sz="1" w:space="0" w:color="CBD5E1"/>
-              <w:right w:val="single" w:sz="1" w:space="0" w:color="CBD5E1"/>
-            </w:tcBorders>
-            <w:shd w:val="clear" w:color="auto" w:fill="2C5F8A"/>
-            <w:tcMar>
-              <w:top w:w="80" w:type="dxa"/>
-              <w:left w:w="120" w:type="dxa"/>
-              <w:bottom w:w="80" w:type="dxa"/>
-              <w:right w:w="120" w:type="dxa"/>
-            </w:tcMar>
-          </w:tcPr>
-          <w:p>
-            <w:pPr>
-              <w:spacing w:before="40" w:after="40"/>
-            </w:pPr>
-            <w:r>
-              <w:rPr>
-                <w:rFonts w:ascii="Arial" w:eastAsia="Arial" w:hAnsi="Arial" w:cs="Arial"/>
-                <w:b/>
-                <w:bCs/>
-                <w:color w:val="FFFFFF"/>
-                <w:sz w:val="18"/>
-                <w:szCs w:val="18"/>
-              </w:rPr>
-              <w:t>Role</w:t>
-            </w:r>
-          </w:p>
-        </w:tc>
-        <w:tc>
-          <w:tcPr>
-            <w:tcW w:w="2349" w:type="dxa"/>
-            <w:tcBorders>
-              <w:top w:val="single" w:sz="1" w:space="0" w:color="CBD5E1"/>
-              <w:left w:val="single" w:sz="1" w:space="0" w:color="CBD5E1"/>
-              <w:bottom w:val="single" w:sz="1" w:space="0" w:color="CBD5E1"/>
-              <w:right w:val="single" w:sz="1" w:space="0" w:color="CBD5E1"/>
-            </w:tcBorders>
-            <w:shd w:val="clear" w:color="auto" w:fill="2C5F8A"/>
-            <w:tcMar>
-              <w:top w:w="80" w:type="dxa"/>
-              <w:left w:w="120" w:type="dxa"/>
-              <w:bottom w:w="80" w:type="dxa"/>
-              <w:right w:w="120" w:type="dxa"/>
-            </w:tcMar>
-          </w:tcPr>
-          <w:p>
-            <w:pPr>
-              <w:spacing w:before="40" w:after="40"/>
-            </w:pPr>
-            <w:r>
-              <w:rPr>
-                <w:rFonts w:ascii="Arial" w:eastAsia="Arial" w:hAnsi="Arial" w:cs="Arial"/>
-                <w:b/>
-                <w:bCs/>
-                <w:color w:val="FFFFFF"/>
-                <w:sz w:val="18"/>
-                <w:szCs w:val="18"/>
-              </w:rPr>
-              <w:t>Name</w:t>
-            </w:r>
-          </w:p>
-        </w:tc>
-        <w:tc>
-          <w:tcPr>
-            <w:tcW w:w="2349" w:type="dxa"/>
-            <w:tcBorders>
-              <w:top w:val="single" w:sz="1" w:space="0" w:color="CBD5E1"/>
-              <w:left w:val="single" w:sz="1" w:space="0" w:color="CBD5E1"/>
-              <w:bottom w:val="single" w:sz="1" w:space="0" w:color="CBD5E1"/>
-              <w:right w:val="single" w:sz="1" w:space="0" w:color="CBD5E1"/>
-            </w:tcBorders>
-            <w:shd w:val="clear" w:color="auto" w:fill="2C5F8A"/>
-            <w:tcMar>
-              <w:top w:w="80" w:type="dxa"/>
-              <w:left w:w="120" w:type="dxa"/>
-              <w:bottom w:w="80" w:type="dxa"/>
-              <w:right w:w="120" w:type="dxa"/>
-            </w:tcMar>
-          </w:tcPr>
-          <w:p>
-            <w:pPr>
-              <w:spacing w:before="40" w:after="40"/>
-            </w:pPr>
-            <w:r>
-              <w:rPr>
-                <w:rFonts w:ascii="Arial" w:eastAsia="Arial" w:hAnsi="Arial" w:cs="Arial"/>
-                <w:b/>
-                <w:bCs/>
-                <w:color w:val="FFFFFF"/>
-                <w:sz w:val="18"/>
-                <w:szCs w:val="18"/>
-              </w:rPr>
-              <w:t>Signature</w:t>
-            </w:r>
-          </w:p>
-        </w:tc>
-        <w:tc>
-          <w:tcPr>
-            <w:tcW w:w="2348" w:type="dxa"/>
-            <w:tcBorders>
-              <w:top w:val="single" w:sz="1" w:space="0" w:color="CBD5E1"/>
-              <w:left w:val="single" w:sz="1" w:space="0" w:color="CBD5E1"/>
-              <w:bottom w:val="single" w:sz="1" w:space="0" w:color="CBD5E1"/>
-              <w:right w:val="single" w:sz="1" w:space="0" w:color="CBD5E1"/>
-            </w:tcBorders>
-            <w:shd w:val="clear" w:color="auto" w:fill="2C5F8A"/>
-            <w:tcMar>
-              <w:top w:w="80" w:type="dxa"/>
-              <w:left w:w="120" w:type="dxa"/>
-              <w:bottom w:w="80" w:type="dxa"/>
-              <w:right w:w="120" w:type="dxa"/>
-            </w:tcMar>
-          </w:tcPr>
-          <w:p>
-            <w:pPr>
-              <w:spacing w:before="40" w:after="40"/>
-            </w:pPr>
-            <w:r>
-              <w:rPr>
-                <w:rFonts w:ascii="Arial" w:eastAsia="Arial" w:hAnsi="Arial" w:cs="Arial"/>
-                <w:b/>
-                <w:bCs/>
-                <w:color w:val="FFFFFF"/>
-                <w:sz w:val="18"/>
-                <w:szCs w:val="18"/>
-              </w:rPr>
-              <w:t>Date</w:t>
-            </w:r>
-          </w:p>
-        </w:tc>
-      </w:tr>
-      <w:tr>
-        <w:tblPrEx>
-          <w:tblCellMar>
-            <w:top w:w="0" w:type="dxa"/>
-            <w:bottom w:w="0" w:type="dxa"/>
-          </w:tblCellMar>
-        </w:tblPrEx>
-        <w:tc>
-          <w:tcPr>
-            <w:tcW w:w="2700" w:type="dxa"/>
-            <w:tcBorders>
-              <w:top w:val="single" w:sz="1" w:space="0" w:color="CBD5E1"/>
-              <w:left w:val="single" w:sz="1" w:space="0" w:color="CBD5E1"/>
-              <w:bottom w:val="single" w:sz="1" w:space="0" w:color="CBD5E1"/>
-              <w:right w:val="single" w:sz="1" w:space="0" w:color="CBD5E1"/>
-            </w:tcBorders>
-            <w:shd w:val="clear" w:color="auto" w:fill="EAF2F8"/>
-            <w:tcMar>
-              <w:top w:w="80" w:type="dxa"/>
-              <w:left w:w="120" w:type="dxa"/>
-              <w:bottom w:w="80" w:type="dxa"/>
-              <w:right w:w="120" w:type="dxa"/>
-            </w:tcMar>
-          </w:tcPr>
-          <w:p>
-            <w:pPr>
-              <w:spacing w:before="40" w:after="40"/>
-            </w:pPr>
-            <w:r>
-              <w:rPr>
-                <w:rFonts w:ascii="Arial" w:eastAsia="Arial" w:hAnsi="Arial" w:cs="Arial"/>
-                <w:color w:val="1E293B"/>
-                <w:sz w:val="19"/>
-                <w:szCs w:val="19"/>
-              </w:rPr>
-              <w:t>VP Operations</w:t>
-            </w:r>
-          </w:p>
-        </w:tc>
-        <w:tc>
-          <w:tcPr>
-            <w:tcW w:w="2349" w:type="dxa"/>
-            <w:tcBorders>
-              <w:top w:val="single" w:sz="1" w:space="0" w:color="CBD5E1"/>
-              <w:left w:val="single" w:sz="1" w:space="0" w:color="CBD5E1"/>
-              <w:bottom w:val="single" w:sz="1" w:space="0" w:color="CBD5E1"/>
-              <w:right w:val="single" w:sz="1" w:space="0" w:color="CBD5E1"/>
-            </w:tcBorders>
-            <w:shd w:val="clear" w:color="auto" w:fill="EAF2F8"/>
-            <w:tcMar>
-              <w:top w:w="80" w:type="dxa"/>
-              <w:left w:w="120" w:type="dxa"/>
-              <w:bottom w:w="80" w:type="dxa"/>
-              <w:right w:w="120" w:type="dxa"/>
-            </w:tcMar>
-          </w:tcPr>
-          <w:p>
-            <w:pPr>
-              <w:spacing w:before="40" w:after="40"/>
-            </w:pPr>
-          </w:p>
-        </w:tc>
-        <w:tc>
-          <w:tcPr>
-            <w:tcW w:w="2349" w:type="dxa"/>
-            <w:tcBorders>
-              <w:top w:val="single" w:sz="1" w:space="0" w:color="CBD5E1"/>
-              <w:left w:val="single" w:sz="1" w:space="0" w:color="CBD5E1"/>
-              <w:bottom w:val="single" w:sz="1" w:space="0" w:color="CBD5E1"/>
-              <w:right w:val="single" w:sz="1" w:space="0" w:color="CBD5E1"/>
-            </w:tcBorders>
-            <w:shd w:val="clear" w:color="auto" w:fill="EAF2F8"/>
-            <w:tcMar>
-              <w:top w:w="80" w:type="dxa"/>
-              <w:left w:w="120" w:type="dxa"/>
-              <w:bottom w:w="80" w:type="dxa"/>
-              <w:right w:w="120" w:type="dxa"/>
-            </w:tcMar>
-          </w:tcPr>
-          <w:p>
-            <w:pPr>
-              <w:spacing w:before="40" w:after="40"/>
-            </w:pPr>
-          </w:p>
-        </w:tc>
-        <w:tc>
-          <w:tcPr>
-            <w:tcW w:w="2348" w:type="dxa"/>
-            <w:tcBorders>
-              <w:top w:val="single" w:sz="1" w:space="0" w:color="CBD5E1"/>
-              <w:left w:val="single" w:sz="1" w:space="0" w:color="CBD5E1"/>
-              <w:bottom w:val="single" w:sz="1" w:space="0" w:color="CBD5E1"/>
-              <w:right w:val="single" w:sz="1" w:space="0" w:color="CBD5E1"/>
-            </w:tcBorders>
-            <w:shd w:val="clear" w:color="auto" w:fill="EAF2F8"/>
-            <w:tcMar>
-              <w:top w:w="80" w:type="dxa"/>
-              <w:left w:w="120" w:type="dxa"/>
-              <w:bottom w:w="80" w:type="dxa"/>
-              <w:right w:w="120" w:type="dxa"/>
-            </w:tcMar>
-          </w:tcPr>
-          <w:p>
-            <w:pPr>
-              <w:spacing w:before="40" w:after="40"/>
-            </w:pPr>
-          </w:p>
-        </w:tc>
-      </w:tr>
-      <w:tr>
-        <w:tblPrEx>
-          <w:tblCellMar>
-            <w:top w:w="0" w:type="dxa"/>
-            <w:bottom w:w="0" w:type="dxa"/>
-          </w:tblCellMar>
-        </w:tblPrEx>
-        <w:tc>
-          <w:tcPr>
-            <w:tcW w:w="2700" w:type="dxa"/>
-            <w:tcBorders>
-              <w:top w:val="single" w:sz="1" w:space="0" w:color="CBD5E1"/>
-              <w:left w:val="single" w:sz="1" w:space="0" w:color="CBD5E1"/>
-              <w:bottom w:val="single" w:sz="1" w:space="0" w:color="CBD5E1"/>
-              <w:right w:val="single" w:sz="1" w:space="0" w:color="CBD5E1"/>
-            </w:tcBorders>
-            <w:tcMar>
-              <w:top w:w="80" w:type="dxa"/>
-              <w:left w:w="120" w:type="dxa"/>
-              <w:bottom w:w="80" w:type="dxa"/>
-              <w:right w:w="120" w:type="dxa"/>
-            </w:tcMar>
-          </w:tcPr>
-          <w:p>
-            <w:pPr>
-              <w:spacing w:before="40" w:after="40"/>
-            </w:pPr>
-            <w:r>
-              <w:rPr>
-                <w:rFonts w:ascii="Arial" w:eastAsia="Arial" w:hAnsi="Arial" w:cs="Arial"/>
-                <w:color w:val="1E293B"/>
-                <w:sz w:val="19"/>
-                <w:szCs w:val="19"/>
-              </w:rPr>
-              <w:t>Director of Operations</w:t>
-            </w:r>
-          </w:p>
-        </w:tc>
-        <w:tc>
-          <w:tcPr>
-            <w:tcW w:w="2349" w:type="dxa"/>
-            <w:tcBorders>
-              <w:top w:val="single" w:sz="1" w:space="0" w:color="CBD5E1"/>
-              <w:left w:val="single" w:sz="1" w:space="0" w:color="CBD5E1"/>
-              <w:bottom w:val="single" w:sz="1" w:space="0" w:color="CBD5E1"/>
-              <w:right w:val="single" w:sz="1" w:space="0" w:color="CBD5E1"/>
-            </w:tcBorders>
-            <w:tcMar>
-              <w:top w:w="80" w:type="dxa"/>
-              <w:left w:w="120" w:type="dxa"/>
-              <w:bottom w:w="80" w:type="dxa"/>
-              <w:right w:w="120" w:type="dxa"/>
-            </w:tcMar>
-          </w:tcPr>
-          <w:p>
-            <w:pPr>
-              <w:spacing w:before="40" w:after="40"/>
-            </w:pPr>
-          </w:p>
-        </w:tc>
-        <w:tc>
-          <w:tcPr>
-            <w:tcW w:w="2349" w:type="dxa"/>
-            <w:tcBorders>
-              <w:top w:val="single" w:sz="1" w:space="0" w:color="CBD5E1"/>
-              <w:left w:val="single" w:sz="1" w:space="0" w:color="CBD5E1"/>
-              <w:bottom w:val="single" w:sz="1" w:space="0" w:color="CBD5E1"/>
-              <w:right w:val="single" w:sz="1" w:space="0" w:color="CBD5E1"/>
-            </w:tcBorders>
-            <w:tcMar>
-              <w:top w:w="80" w:type="dxa"/>
-              <w:left w:w="120" w:type="dxa"/>
-              <w:bottom w:w="80" w:type="dxa"/>
-              <w:right w:w="120" w:type="dxa"/>
-            </w:tcMar>
-          </w:tcPr>
-          <w:p>
-            <w:pPr>
-              <w:spacing w:before="40" w:after="40"/>
-            </w:pPr>
-          </w:p>
-        </w:tc>
-        <w:tc>
-          <w:tcPr>
-            <w:tcW w:w="2348" w:type="dxa"/>
-            <w:tcBorders>
-              <w:top w:val="single" w:sz="1" w:space="0" w:color="CBD5E1"/>
-              <w:left w:val="single" w:sz="1" w:space="0" w:color="CBD5E1"/>
-              <w:bottom w:val="single" w:sz="1" w:space="0" w:color="CBD5E1"/>
-              <w:right w:val="single" w:sz="1" w:space="0" w:color="CBD5E1"/>
-            </w:tcBorders>
-            <w:tcMar>
-              <w:top w:w="80" w:type="dxa"/>
-              <w:left w:w="120" w:type="dxa"/>
-              <w:bottom w:w="80" w:type="dxa"/>
-              <w:right w:w="120" w:type="dxa"/>
-            </w:tcMar>
-          </w:tcPr>
-          <w:p>
-            <w:pPr>
-              <w:spacing w:before="40" w:after="40"/>
-            </w:pPr>
-          </w:p>
-        </w:tc>
-      </w:tr>
-      <w:tr>
-        <w:tblPrEx>
-          <w:tblCellMar>
-            <w:top w:w="0" w:type="dxa"/>
-            <w:bottom w:w="0" w:type="dxa"/>
-          </w:tblCellMar>
-        </w:tblPrEx>
-        <w:tc>
-          <w:tcPr>
-            <w:tcW w:w="2700" w:type="dxa"/>
-            <w:tcBorders>
-              <w:top w:val="single" w:sz="1" w:space="0" w:color="CBD5E1"/>
-              <w:left w:val="single" w:sz="1" w:space="0" w:color="CBD5E1"/>
-              <w:bottom w:val="single" w:sz="1" w:space="0" w:color="CBD5E1"/>
-              <w:right w:val="single" w:sz="1" w:space="0" w:color="CBD5E1"/>
-            </w:tcBorders>
-            <w:shd w:val="clear" w:color="auto" w:fill="EAF2F8"/>
-            <w:tcMar>
-              <w:top w:w="80" w:type="dxa"/>
-              <w:left w:w="120" w:type="dxa"/>
-              <w:bottom w:w="80" w:type="dxa"/>
-              <w:right w:w="120" w:type="dxa"/>
-            </w:tcMar>
-          </w:tcPr>
-          <w:p>
-            <w:pPr>
-              <w:spacing w:before="40" w:after="40"/>
-            </w:pPr>
-            <w:r>
-              <w:rPr>
-                <w:rFonts w:ascii="Arial" w:eastAsia="Arial" w:hAnsi="Arial" w:cs="Arial"/>
-                <w:color w:val="1E293B"/>
-                <w:sz w:val="19"/>
-                <w:szCs w:val="19"/>
-              </w:rPr>
-              <w:t>Director of Technology</w:t>
-            </w:r>
-          </w:p>
-        </w:tc>
-        <w:tc>
-          <w:tcPr>
-            <w:tcW w:w="2349" w:type="dxa"/>
-            <w:tcBorders>
-              <w:top w:val="single" w:sz="1" w:space="0" w:color="CBD5E1"/>
-              <w:left w:val="single" w:sz="1" w:space="0" w:color="CBD5E1"/>
-              <w:bottom w:val="single" w:sz="1" w:space="0" w:color="CBD5E1"/>
-              <w:right w:val="single" w:sz="1" w:space="0" w:color="CBD5E1"/>
-            </w:tcBorders>
-            <w:shd w:val="clear" w:color="auto" w:fill="EAF2F8"/>
-            <w:tcMar>
-              <w:top w:w="80" w:type="dxa"/>
-              <w:left w:w="120" w:type="dxa"/>
-              <w:bottom w:w="80" w:type="dxa"/>
-              <w:right w:w="120" w:type="dxa"/>
-            </w:tcMar>
-          </w:tcPr>
-          <w:p>
-            <w:pPr>
-              <w:spacing w:before="40" w:after="40"/>
-            </w:pPr>
-          </w:p>
-        </w:tc>
-        <w:tc>
-          <w:tcPr>
-            <w:tcW w:w="2349" w:type="dxa"/>
-            <w:tcBorders>
-              <w:top w:val="single" w:sz="1" w:space="0" w:color="CBD5E1"/>
-              <w:left w:val="single" w:sz="1" w:space="0" w:color="CBD5E1"/>
-              <w:bottom w:val="single" w:sz="1" w:space="0" w:color="CBD5E1"/>
-              <w:right w:val="single" w:sz="1" w:space="0" w:color="CBD5E1"/>
-            </w:tcBorders>
-            <w:shd w:val="clear" w:color="auto" w:fill="EAF2F8"/>
-            <w:tcMar>
-              <w:top w:w="80" w:type="dxa"/>
-              <w:left w:w="120" w:type="dxa"/>
-              <w:bottom w:w="80" w:type="dxa"/>
-              <w:right w:w="120" w:type="dxa"/>
-            </w:tcMar>
-          </w:tcPr>
-          <w:p>
-            <w:pPr>
-              <w:spacing w:before="40" w:after="40"/>
-            </w:pPr>
-          </w:p>
-        </w:tc>
-        <w:tc>
-          <w:tcPr>
-            <w:tcW w:w="2348" w:type="dxa"/>
-            <w:tcBorders>
-              <w:top w:val="single" w:sz="1" w:space="0" w:color="CBD5E1"/>
-              <w:left w:val="single" w:sz="1" w:space="0" w:color="CBD5E1"/>
-              <w:bottom w:val="single" w:sz="1" w:space="0" w:color="CBD5E1"/>
-              <w:right w:val="single" w:sz="1" w:space="0" w:color="CBD5E1"/>
-            </w:tcBorders>
-            <w:shd w:val="clear" w:color="auto" w:fill="EAF2F8"/>
-            <w:tcMar>
-              <w:top w:w="80" w:type="dxa"/>
-              <w:left w:w="120" w:type="dxa"/>
-              <w:bottom w:w="80" w:type="dxa"/>
-              <w:right w:w="120" w:type="dxa"/>
-            </w:tcMar>
-          </w:tcPr>
-          <w:p>
-            <w:pPr>
-              <w:spacing w:before="40" w:after="40"/>
-            </w:pPr>
-          </w:p>
-        </w:tc>
-      </w:tr>
-    </w:tbl>
     <w:p/>
     <w:sectPr>
       <w:headerReference w:type="default" r:id="rId7"/>
@@ -5608,6 +4803,33 @@
         <w:szCs w:val="16"/>
       </w:rPr>
       <w:fldChar w:fldCharType="end"/>
+    </w:r>
+    <w:r>
+      <w:rPr>
+        <w:rFonts w:ascii="Arial" w:eastAsia="Arial" w:hAnsi="Arial" w:cs="Arial"/>
+        <w:color w:val="64748B"/>
+        <w:sz w:val="16"/>
+        <w:szCs w:val="16"/>
+      </w:rPr>
+      <w:br/>
+    </w:r>
+    <w:r>
+      <w:rPr>
+        <w:rFonts w:ascii="Arial" w:eastAsia="Arial" w:hAnsi="Arial" w:cs="Arial"/>
+        <w:color w:val="64748B"/>
+        <w:sz w:val="16"/>
+        <w:szCs w:val="16"/>
+      </w:rPr>
+      <w:br/>
+    </w:r>
+    <w:r>
+      <w:rPr>
+        <w:rFonts w:ascii="Arial" w:eastAsia="Arial" w:hAnsi="Arial" w:cs="Arial"/>
+        <w:color w:val="64748B"/>
+        <w:sz w:val="16"/>
+        <w:szCs w:val="16"/>
+      </w:rPr>
+      <w:t>This project was designed and built with the assistance of Claude (Anthropic), an AI coding and reasoning assistant. All architecture decisions, domain logic, data models, and analytical frameworks were directed and validated by the author.</w:t>
     </w:r>
   </w:p>
 </w:ftr>
@@ -6441,6 +5663,48 @@
       <w:szCs w:val="20"/>
     </w:rPr>
   </w:style>
+  <w:style w:type="paragraph" w:styleId="Header">
+    <w:name w:val="header"/>
+    <w:basedOn w:val="Normal"/>
+    <w:link w:val="HeaderChar"/>
+    <w:uiPriority w:val="99"/>
+    <w:unhideWhenUsed/>
+    <w:rsid w:val="002D4178"/>
+    <w:pPr>
+      <w:tabs>
+        <w:tab w:val="center" w:pos="4513"/>
+        <w:tab w:val="right" w:pos="9026"/>
+      </w:tabs>
+    </w:pPr>
+  </w:style>
+  <w:style w:type="character" w:customStyle="1" w:styleId="HeaderChar">
+    <w:name w:val="Header Char"/>
+    <w:basedOn w:val="DefaultParagraphFont"/>
+    <w:link w:val="Header"/>
+    <w:uiPriority w:val="99"/>
+    <w:rsid w:val="002D4178"/>
+  </w:style>
+  <w:style w:type="paragraph" w:styleId="Footer">
+    <w:name w:val="footer"/>
+    <w:basedOn w:val="Normal"/>
+    <w:link w:val="FooterChar"/>
+    <w:uiPriority w:val="99"/>
+    <w:unhideWhenUsed/>
+    <w:rsid w:val="002D4178"/>
+    <w:pPr>
+      <w:tabs>
+        <w:tab w:val="center" w:pos="4513"/>
+        <w:tab w:val="right" w:pos="9026"/>
+      </w:tabs>
+    </w:pPr>
+  </w:style>
+  <w:style w:type="character" w:customStyle="1" w:styleId="FooterChar">
+    <w:name w:val="Footer Char"/>
+    <w:basedOn w:val="DefaultParagraphFont"/>
+    <w:link w:val="Footer"/>
+    <w:uiPriority w:val="99"/>
+    <w:rsid w:val="002D4178"/>
+  </w:style>
 </w:styles>
 </file>
 

</xml_diff>